<commit_message>
Add monochrome SRS diagrams and DOCX fixes
This commit adds monochrome Draw.io, SVG, and PNG variants for the system context and traceability chain diagrams, along with the source XML files referenced from the SRS markdown. It also updates the DOCX generation scripts to skip HTML details/code blocks and to prefer PNG image fallbacks when SVG references are used so the generated Word document renders cleanly and consistently.
</commit_message>
<xml_diff>
--- a/Tugas 2/Draft_SRS_Medkreminfo.docx
+++ b/Tugas 2/Draft_SRS_Medkreminfo.docx
@@ -3425,7 +3425,7 @@
       <w:r>
         <w:drawing>
           <wp:inline xmlns:a="http://schemas.openxmlformats.org/drawingml/2006/main" xmlns:pic="http://schemas.openxmlformats.org/drawingml/2006/picture">
-            <wp:extent cx="5039995" cy="2668233"/>
+            <wp:extent cx="5039995" cy="2621571"/>
             <wp:docPr id="1" name="Picture 1"/>
             <wp:cNvGraphicFramePr>
               <a:graphicFrameLocks noChangeAspect="1"/>
@@ -3446,7 +3446,7 @@
                   <pic:spPr>
                     <a:xfrm>
                       <a:off x="0" y="0"/>
-                      <a:ext cx="5039995" cy="2668233"/>
+                      <a:ext cx="5039995" cy="2621571"/>
                     </a:xfrm>
                     <a:prstGeom prst="rect"/>
                   </pic:spPr>
@@ -3468,7 +3468,7 @@
           <w:i/>
           <w:sz w:val="22"/>
         </w:rPr>
-        <w:t>Gambar 1. Diagram konteks konseptual Sistem Informasi Layanan Pemesanan Konten Medkreminfo.</w:t>
+        <w:t>Gambar 1. Diagram konteks konseptual Sistem Informasi Layanan Pemesanan Konten Medkreminfo (Monokrom/Hitam Putih).</w:t>
       </w:r>
     </w:p>
     <w:p>
@@ -3481,7 +3481,7 @@
           <w:rFonts w:ascii="Times New Roman" w:hAnsi="Times New Roman"/>
           <w:sz w:val="24"/>
         </w:rPr>
-        <w:t>Diagram ini bersifat konseptual. Detail BPMN, use case diagram, activity diagram, dan sequence diagram merupakan artefak lanjutan yang melengkapi paket analisis pada pertemuan selanjutnya.</w:t>
+        <w:t>Diagram ini disajikan dalam format monokrom (hitam-putih) standar dokumen teknis/SRS. Berkas sumber diagram berbasis XML dapat diakses melalui berkas Draw.io XML [diagram_system_context.drawio](diagram_system_context.drawio) / [diagram_system_context.xml](diagram_system_context.xml) serta berkas vektor [diagram_system_context.svg](diagram_system_context.svg). Detail BPMN, use case diagram, activity diagram, dan sequence diagram merupakan artefak lanjutan yang melengkapi paket analisis pada pertemuan selanjutnya.</w:t>
       </w:r>
     </w:p>
     <w:p>
@@ -14360,7 +14360,7 @@
       <w:r>
         <w:drawing>
           <wp:inline xmlns:a="http://schemas.openxmlformats.org/drawingml/2006/main" xmlns:pic="http://schemas.openxmlformats.org/drawingml/2006/picture">
-            <wp:extent cx="5039995" cy="1482351"/>
+            <wp:extent cx="5039995" cy="1412359"/>
             <wp:docPr id="2" name="Picture 2"/>
             <wp:cNvGraphicFramePr>
               <a:graphicFrameLocks noChangeAspect="1"/>
@@ -14381,7 +14381,7 @@
                   <pic:spPr>
                     <a:xfrm>
                       <a:off x="0" y="0"/>
-                      <a:ext cx="5039995" cy="1482351"/>
+                      <a:ext cx="5039995" cy="1412359"/>
                     </a:xfrm>
                     <a:prstGeom prst="rect"/>
                   </pic:spPr>
@@ -14403,7 +14403,7 @@
           <w:i/>
           <w:sz w:val="22"/>
         </w:rPr>
-        <w:t>Gambar 2. Contoh rantai traceability dari evidence sampai model berikutnya.</w:t>
+        <w:t>Gambar 2. Contoh rantai traceability dari evidence sampai model berikutnya (Monokrom/Hitam Putih).</w:t>
       </w:r>
     </w:p>
     <w:p>
@@ -14418,6 +14418,19 @@
           <w:sz w:val="22"/>
         </w:rPr>
         <w:t>Prinsip: setiap artefak penting memiliki alasan keberadaan dan hubungan yang dapat ditelusuri.</w:t>
+      </w:r>
+    </w:p>
+    <w:p>
+      <w:pPr>
+        <w:spacing w:line="360" w:lineRule="auto" w:before="0" w:after="0"/>
+        <w:jc w:val="both"/>
+      </w:pPr>
+      <w:r>
+        <w:rPr>
+          <w:rFonts w:ascii="Times New Roman" w:hAnsi="Times New Roman"/>
+          <w:sz w:val="24"/>
+        </w:rPr>
+        <w:t>Berkas sumber diagram berbasis XML dapat diakses melalui berkas Draw.io XML [diagram_traceability_chain.drawio](diagram_traceability_chain.drawio) / [diagram_traceability_chain.xml](diagram_traceability_chain.xml) serta berkas vektor [diagram_traceability_chain.svg](diagram_traceability_chain.svg).</w:t>
       </w:r>
     </w:p>
     <w:p>

</xml_diff>